<commit_message>
Add complete customer setup and operation guide
</commit_message>
<xml_diff>
--- a/docs/Star_Arm_102_ACT_客户运行指南.docx
+++ b/docs/Star_Arm_102_ACT_客户运行指南.docx
@@ -3076,7 +3076,7 @@
           <w:color w:val="1D2935"/>
           <w:sz w:val="19"/>
         </w:rPr>
-        <w:t>Star-Arm-102/Lerobot/stararm102.m（参考版本）：Star Arm 102 LeRobot 流程参考，包含环境、串口、相机、采集、训练和推理命令。该参考中的 /dev/ttyUSB0、/dev/ttyUSB1、/dev/video2、/dev/video4 都是示例，客户需重新检测。</w:t>
+        <w:t>Star-Arm-102/Lerobot/stararm102.md（官方文档）：Star Arm 102 LeRobot 流程参考，包含环境、串口、相机、采集、训练和推理命令。该参考中的 /dev/ttyUSB0、/dev/ttyUSB1、/dev/video2、/dev/video4 都是示例，客户需重新检测。</w:t>
       </w:r>
     </w:p>
     <w:p>
@@ -3186,7 +3186,7 @@
           <w:color w:val="526575"/>
           <w:sz w:val="17"/>
         </w:rPr>
-        <w:t>Star-Arm-102 指定版本：</w:t>
+        <w:t>Star Arm 102 官方教程：</w:t>
       </w:r>
     </w:p>
     <w:p>
@@ -3201,7 +3201,7 @@
           <w:color w:val="2F6B8A"/>
           <w:sz w:val="16"/>
         </w:rPr>
-        <w:t>https://github.com/servodevelop/Star-Arm-102/blob/0896306e40891c3ee4c97228e85dd708d61326de/Lerobot/stararm102.m</w:t>
+        <w:t>https://github.com/servodevelop/Star-Arm-102/blob/main/Lerobot/stararm102.md</w:t>
       </w:r>
     </w:p>
     <w:p>

</xml_diff>

<commit_message>
Add training setup reference photos
</commit_message>
<xml_diff>
--- a/docs/Star_Arm_102_ACT_客户运行指南.docx
+++ b/docs/Star_Arm_102_ACT_客户运行指南.docx
@@ -443,6 +443,178 @@
         <w:widowControl/>
         <w:spacing w:after="20"/>
       </w:pPr>
+    </w:p>
+    <w:p>
+      <w:pPr>
+        <w:pStyle w:val="Heading1"/>
+        <w:pageBreakBefore w:val="0"/>
+      </w:pPr>
+      <w:r>
+        <w:t>训练场景摆放参考</w:t>
+      </w:r>
+    </w:p>
+    <w:p>
+      <w:pPr>
+        <w:keepNext/>
+      </w:pPr>
+      <w:r>
+        <w:t>采集示范或运行模型前，参照以下照片摆放相机支架、Star Arm 102 从臂和操作垫。固定相机朝向、从臂底座与操作垫的相对位置；让 up 和 front 两路画面都能清楚拍到训练工作区。照片未标注精确距离，最终以实时画面和实际训练示范为准。</w:t>
+      </w:r>
+    </w:p>
+    <w:p>
+      <w:pPr>
+        <w:keepNext/>
+        <w:spacing w:before="0" w:after="0"/>
+      </w:pPr>
+      <w:r>
+        <w:drawing>
+          <wp:inline xmlns:a="http://schemas.openxmlformats.org/drawingml/2006/main" xmlns:pic="http://schemas.openxmlformats.org/drawingml/2006/picture">
+            <wp:extent cx="4709160" cy="3531870"/>
+            <wp:docPr id="1" name="Picture 1" descr="训练场景侧面总览。相机支架位于操作垫左侧，Star Arm 102 从臂固定在右侧，镜头朝向操作区域。"/>
+            <wp:cNvGraphicFramePr>
+              <a:graphicFrameLocks noChangeAspect="1"/>
+            </wp:cNvGraphicFramePr>
+            <a:graphic>
+              <a:graphicData uri="http://schemas.openxmlformats.org/drawingml/2006/picture">
+                <pic:pic>
+                  <pic:nvPicPr>
+                    <pic:cNvPr id="0" name="setup-side.jpg"/>
+                    <pic:cNvPicPr/>
+                  </pic:nvPicPr>
+                  <pic:blipFill>
+                    <a:blip r:embed="rId11"/>
+                    <a:stretch>
+                      <a:fillRect/>
+                    </a:stretch>
+                  </pic:blipFill>
+                  <pic:spPr>
+                    <a:xfrm>
+                      <a:off x="0" y="0"/>
+                      <a:ext cx="4709160" cy="3531870"/>
+                    </a:xfrm>
+                    <a:prstGeom prst="rect"/>
+                  </pic:spPr>
+                </pic:pic>
+              </a:graphicData>
+            </a:graphic>
+          </wp:inline>
+        </w:drawing>
+      </w:r>
+    </w:p>
+    <w:p>
+      <w:pPr>
+        <w:keepLines/>
+        <w:spacing w:after="0"/>
+      </w:pPr>
+      <w:r>
+        <w:t>侧面总览：相机支架位于操作垫左侧，Star Arm 102 从臂固定在右侧，镜头朝向操作区域。</w:t>
+      </w:r>
+    </w:p>
+    <w:p>
+      <w:pPr>
+        <w:keepNext/>
+        <w:spacing w:before="0" w:after="0"/>
+      </w:pPr>
+      <w:r>
+        <w:drawing>
+          <wp:inline xmlns:a="http://schemas.openxmlformats.org/drawingml/2006/main" xmlns:pic="http://schemas.openxmlformats.org/drawingml/2006/picture">
+            <wp:extent cx="4709160" cy="3515388"/>
+            <wp:docPr id="2" name="Picture 2" descr="训练场景斜侧视角。检查从臂、操作垫和方块的相对位置；方块放在训练示范覆盖的起始区域。"/>
+            <wp:cNvGraphicFramePr>
+              <a:graphicFrameLocks noChangeAspect="1"/>
+            </wp:cNvGraphicFramePr>
+            <a:graphic>
+              <a:graphicData uri="http://schemas.openxmlformats.org/drawingml/2006/picture">
+                <pic:pic>
+                  <pic:nvPicPr>
+                    <pic:cNvPr id="0" name="setup-oblique.jpg"/>
+                    <pic:cNvPicPr/>
+                  </pic:nvPicPr>
+                  <pic:blipFill>
+                    <a:blip r:embed="rId12"/>
+                    <a:stretch>
+                      <a:fillRect/>
+                    </a:stretch>
+                  </pic:blipFill>
+                  <pic:spPr>
+                    <a:xfrm>
+                      <a:off x="0" y="0"/>
+                      <a:ext cx="4709160" cy="3515388"/>
+                    </a:xfrm>
+                    <a:prstGeom prst="rect"/>
+                  </pic:spPr>
+                </pic:pic>
+              </a:graphicData>
+            </a:graphic>
+          </wp:inline>
+        </w:drawing>
+      </w:r>
+    </w:p>
+    <w:p>
+      <w:pPr>
+        <w:keepLines/>
+        <w:spacing w:after="0"/>
+      </w:pPr>
+      <w:r>
+        <w:t>斜侧视角：检查从臂、操作垫和方块的相对位置；方块放在训练示范覆盖的起始区域。</w:t>
+      </w:r>
+    </w:p>
+    <w:p>
+      <w:pPr>
+        <w:keepNext/>
+        <w:spacing w:before="0" w:after="0"/>
+      </w:pPr>
+      <w:r>
+        <w:drawing>
+          <wp:inline xmlns:a="http://schemas.openxmlformats.org/drawingml/2006/main" xmlns:pic="http://schemas.openxmlformats.org/drawingml/2006/picture">
+            <wp:extent cx="4709160" cy="3513033"/>
+            <wp:docPr id="3" name="Picture 3" descr="训练场景正面视角。检查相机支架与从臂的前后关系，并确认方块区域没有被机械臂底座遮挡。"/>
+            <wp:cNvGraphicFramePr>
+              <a:graphicFrameLocks noChangeAspect="1"/>
+            </wp:cNvGraphicFramePr>
+            <a:graphic>
+              <a:graphicData uri="http://schemas.openxmlformats.org/drawingml/2006/picture">
+                <pic:pic>
+                  <pic:nvPicPr>
+                    <pic:cNvPr id="0" name="setup-front.jpg"/>
+                    <pic:cNvPicPr/>
+                  </pic:nvPicPr>
+                  <pic:blipFill>
+                    <a:blip r:embed="rId13"/>
+                    <a:stretch>
+                      <a:fillRect/>
+                    </a:stretch>
+                  </pic:blipFill>
+                  <pic:spPr>
+                    <a:xfrm>
+                      <a:off x="0" y="0"/>
+                      <a:ext cx="4709160" cy="3513033"/>
+                    </a:xfrm>
+                    <a:prstGeom prst="rect"/>
+                  </pic:spPr>
+                </pic:pic>
+              </a:graphicData>
+            </a:graphic>
+          </wp:inline>
+        </w:drawing>
+      </w:r>
+    </w:p>
+    <w:p>
+      <w:pPr>
+        <w:keepLines/>
+        <w:spacing w:after="0"/>
+      </w:pPr>
+      <w:r>
+        <w:t>正面视角：检查相机支架与从臂的前后关系，并确认方块区域没有被机械臂底座遮挡。</w:t>
+      </w:r>
+    </w:p>
+    <w:p>
+      <w:pPr>
+        <w:spacing w:before="0"/>
+      </w:pPr>
+      <w:r>
+        <w:t>每次采集或评估前，核对两路相机画面没有对调、镜头没有明显偏转，并将方块放在训练数据包含的位置范围内。照片中的方块位置只是摆放示例，不代表单一固定坐标。</w:t>
+      </w:r>
     </w:p>
     <w:p>
       <w:pPr>

</xml_diff>

<commit_message>
Fix README labels and link trained demo video
</commit_message>
<xml_diff>
--- a/docs/Star_Arm_102_ACT_客户运行指南.docx
+++ b/docs/Star_Arm_102_ACT_客户运行指南.docx
@@ -615,6 +615,36 @@
       <w:r>
         <w:t>每次采集或评估前，核对两路相机画面没有对调、镜头没有明显偏转，并将方块放在训练数据包含的位置范围内。照片中的方块位置只是摆放示例，不代表单一固定坐标。</w:t>
       </w:r>
+    </w:p>
+    <w:p>
+      <w:pPr>
+        <w:pStyle w:val="Heading1"/>
+      </w:pPr>
+      <w:r>
+        <w:t>训练完成后的现场视频</w:t>
+      </w:r>
+    </w:p>
+    <w:p>
+      <w:pPr>
+        <w:keepNext/>
+      </w:pPr>
+      <w:r>
+        <w:t>可观看或下载训练完成后的现场视频（MP4，约 61 MB）：</w:t>
+      </w:r>
+    </w:p>
+    <w:p>
+      <w:pPr>
+        <w:spacing w:after="0"/>
+      </w:pPr>
+      <w:hyperlink r:id="rId14">
+        <w:r>
+          <w:rPr>
+            <w:color w:val="0563C1"/>
+            <w:u w:val="single"/>
+          </w:rPr>
+          <w:t>观看 Star Arm 102 训练完成后的现场视频</w:t>
+        </w:r>
+      </w:hyperlink>
     </w:p>
     <w:p>
       <w:pPr>

</xml_diff>